<commit_message>
Add full seminar draft with findings, discussion and summary
Findings, discussion and summary chapters are written on the simulated
practice dataset and marked as such in the document; two Hebrew sources
added (Ben-Asher & Berger 2013; Salpeti et al. 2019).

Co-Authored-By: Claude Fable 5.1 <noreply@anthropic.com>
Claude-Session: https://claude.ai/code/session_019RaBW72rT1xkbcXD9zJSh3
</commit_message>
<xml_diff>
--- a/seminar/רשימת_מקורות_מסכים_שינה_פעילות_לקויות_למידה.docx
+++ b/seminar/רשימת_מקורות_מסכים_שינה_פעילות_לקויות_למידה.docx
@@ -35,7 +35,7 @@
           <w:szCs w:val="20"/>
           <w:rtl/>
         </w:rPr>
-        <w:t xml:space="preserve">בעבודה משמשים 22 מקורות: 7 מאמרים שפיטים באנגלית (כולם בגישה פתוחה מלאה, 2020 ואילך) ו-15 מקורות בעברית, מהם 10 מכתבי עת שפיטים או ניירות עמדה מקצועיים בגישה מלאה, ו-5 מקורות רשמיים (כנסת, משרד הבריאות, משרד החינוך, איגוד האינטרנט) ומאמר מקצועי אחד. עמודת "סטטוס" מסמנת מה נדרש עוד לאמת מול המאמר המלא. תאריך הכנת הרשימה: ספטמבר 2026.</w:t>
+        <w:t xml:space="preserve">בעבודה משמשים 24 מקורות: 7 מאמרים שפיטים באנגלית (כולם בגישה פתוחה מלאה, 2020 ואילך) ו-17 מקורות בעברית, מהם 12 מכתבי עת שפיטים או ניירות עמדה מקצועיים בגישה מלאה, ו-5 מקורות רשמיים (כנסת, משרד הבריאות, משרד החינוך, איגוד האינטרנט) ומאמר מקצועי אחד. עמודת "סטטוס" מסמנת מה נדרש עוד לאמת מול המאמר המלא. תאריך הכנת הרשימה: ספטמבר 2026.</w:t>
       </w:r>
     </w:p>
     <w:p>
@@ -1661,7 +1661,7 @@
           <w:szCs w:val="24"/>
           <w:rtl/>
         </w:rPr>
-        <w:t xml:space="preserve">מקורות בעברית (15)</w:t>
+        <w:t xml:space="preserve">מקורות בעברית (17)</w:t>
       </w:r>
     </w:p>
     <w:tbl>
@@ -4462,6 +4462,332 @@
                 <w:rtl/>
               </w:rPr>
               <w:t xml:space="preserve">לאמת כותרת העמוד</w:t>
+            </w:r>
+          </w:p>
+        </w:tc>
+      </w:tr>
+      <w:tr>
+        <w:tc>
+          <w:tcPr>
+            <w:tcW w:type="dxa" w:w="400"/>
+          </w:tcPr>
+          <w:p>
+            <w:pPr>
+              <w:bidi/>
+              <w:spacing w:after="40" w:line="240"/>
+              <w:jc w:val="right"/>
+            </w:pPr>
+            <w:r>
+              <w:rPr>
+                <w:rFonts w:ascii="Times New Roman" w:cs="David" w:eastAsia="David" w:hAnsi="Times New Roman"/>
+                <w:b w:val="false"/>
+                <w:bCs w:val="false"/>
+                <w:sz w:val="18"/>
+                <w:szCs w:val="18"/>
+                <w:rtl/>
+              </w:rPr>
+              <w:t xml:space="preserve">23</w:t>
+            </w:r>
+          </w:p>
+        </w:tc>
+        <w:tc>
+          <w:tcPr>
+            <w:tcW w:type="dxa" w:w="3600"/>
+          </w:tcPr>
+          <w:p>
+            <w:pPr>
+              <w:bidi/>
+              <w:spacing w:after="40" w:line="240"/>
+              <w:jc w:val="right"/>
+            </w:pPr>
+            <w:r>
+              <w:rPr>
+                <w:rFonts w:ascii="Times New Roman" w:cs="David" w:eastAsia="David" w:hAnsi="Times New Roman"/>
+                <w:b w:val="false"/>
+                <w:bCs w:val="false"/>
+                <w:sz w:val="18"/>
+                <w:szCs w:val="18"/>
+                <w:rtl/>
+              </w:rPr>
+              <w:t xml:space="preserve">בן-אשר, ס', וברגר, ר' (2013). שיפור כישורי למידה של תלמידות עם ליקויי למידה באמצעות אימון בתנועה משולב בהתערבות קוגניטיבית-התנהגותית: מחקר גישוש. בתנועה, י(3), 287-307.</w:t>
+            </w:r>
+          </w:p>
+        </w:tc>
+        <w:tc>
+          <w:tcPr>
+            <w:tcW w:type="dxa" w:w="1700"/>
+          </w:tcPr>
+          <w:p>
+            <w:pPr>
+              <w:bidi/>
+              <w:spacing w:after="40" w:line="240"/>
+              <w:jc w:val="right"/>
+            </w:pPr>
+            <w:r>
+              <w:rPr>
+                <w:rFonts w:ascii="Times New Roman" w:cs="David" w:eastAsia="David" w:hAnsi="Times New Roman"/>
+                <w:b w:val="false"/>
+                <w:bCs w:val="false"/>
+                <w:sz w:val="18"/>
+                <w:szCs w:val="18"/>
+                <w:rtl/>
+              </w:rPr>
+              <w:t xml:space="preserve">מאמר שפיט (בתנועה), מחקר גישוש, 6 תלמידות עם לקות למידה</w:t>
+            </w:r>
+          </w:p>
+        </w:tc>
+        <w:tc>
+          <w:tcPr>
+            <w:tcW w:type="dxa" w:w="2300"/>
+          </w:tcPr>
+          <w:p>
+            <w:pPr>
+              <w:bidi w:val="false"/>
+              <w:spacing w:after="40" w:line="240"/>
+              <w:jc w:val="left"/>
+            </w:pPr>
+            <w:r>
+              <w:rPr>
+                <w:rFonts w:ascii="Times New Roman" w:cs="David" w:eastAsia="David" w:hAnsi="Times New Roman"/>
+                <w:b w:val="false"/>
+                <w:bCs w:val="false"/>
+                <w:sz w:val="18"/>
+                <w:szCs w:val="18"/>
+                <w:rtl w:val="false"/>
+              </w:rPr>
+              <w:t xml:space="preserve">JSTOR 23635749 (הורד) / אתר וינגייט</w:t>
+            </w:r>
+          </w:p>
+        </w:tc>
+        <w:tc>
+          <w:tcPr>
+            <w:tcW w:type="dxa" w:w="3300"/>
+          </w:tcPr>
+          <w:p>
+            <w:pPr>
+              <w:bidi/>
+              <w:spacing w:after="40" w:line="240"/>
+              <w:jc w:val="right"/>
+            </w:pPr>
+            <w:r>
+              <w:rPr>
+                <w:rFonts w:ascii="Times New Roman" w:cs="David" w:eastAsia="David" w:hAnsi="Times New Roman"/>
+                <w:b w:val="false"/>
+                <w:bCs w:val="false"/>
+                <w:sz w:val="18"/>
+                <w:szCs w:val="18"/>
+                <w:rtl/>
+              </w:rPr>
+              <w:t xml:space="preserve">אימון תנועתי שבועי כחמישה חודשים: שיפור מובהק בכשרים קוגניטיביים, בהישגים ובקריאה, ושינוי ב-EEG.</w:t>
+            </w:r>
+          </w:p>
+        </w:tc>
+        <w:tc>
+          <w:tcPr>
+            <w:tcW w:type="dxa" w:w="1500"/>
+          </w:tcPr>
+          <w:p>
+            <w:pPr>
+              <w:bidi/>
+              <w:spacing w:after="40" w:line="240"/>
+              <w:jc w:val="right"/>
+            </w:pPr>
+            <w:r>
+              <w:rPr>
+                <w:rFonts w:ascii="Times New Roman" w:cs="David" w:eastAsia="David" w:hAnsi="Times New Roman"/>
+                <w:b w:val="false"/>
+                <w:bCs w:val="false"/>
+                <w:sz w:val="18"/>
+                <w:szCs w:val="18"/>
+                <w:rtl/>
+              </w:rPr>
+              <w:t xml:space="preserve">1.4, 4.2, 4.6, 4.8</w:t>
+            </w:r>
+          </w:p>
+        </w:tc>
+        <w:tc>
+          <w:tcPr>
+            <w:tcW w:type="dxa" w:w="1200"/>
+          </w:tcPr>
+          <w:p>
+            <w:pPr>
+              <w:bidi/>
+              <w:spacing w:after="40" w:line="240"/>
+              <w:jc w:val="right"/>
+            </w:pPr>
+            <w:r>
+              <w:rPr>
+                <w:rFonts w:ascii="Times New Roman" w:cs="David" w:eastAsia="David" w:hAnsi="Times New Roman"/>
+                <w:b w:val="false"/>
+                <w:bCs w:val="false"/>
+                <w:sz w:val="18"/>
+                <w:szCs w:val="18"/>
+                <w:rtl/>
+              </w:rPr>
+              <w:t xml:space="preserve">מאומת (מהמאמר עצמו)</w:t>
+            </w:r>
+          </w:p>
+        </w:tc>
+      </w:tr>
+      <w:tr>
+        <w:tc>
+          <w:tcPr>
+            <w:tcW w:type="dxa" w:w="400"/>
+          </w:tcPr>
+          <w:p>
+            <w:pPr>
+              <w:bidi/>
+              <w:spacing w:after="40" w:line="240"/>
+              <w:jc w:val="right"/>
+            </w:pPr>
+            <w:r>
+              <w:rPr>
+                <w:rFonts w:ascii="Times New Roman" w:cs="David" w:eastAsia="David" w:hAnsi="Times New Roman"/>
+                <w:b w:val="false"/>
+                <w:bCs w:val="false"/>
+                <w:sz w:val="18"/>
+                <w:szCs w:val="18"/>
+                <w:rtl/>
+              </w:rPr>
+              <w:t xml:space="preserve">24</w:t>
+            </w:r>
+          </w:p>
+        </w:tc>
+        <w:tc>
+          <w:tcPr>
+            <w:tcW w:type="dxa" w:w="3600"/>
+          </w:tcPr>
+          <w:p>
+            <w:pPr>
+              <w:bidi/>
+              <w:spacing w:after="40" w:line="240"/>
+              <w:jc w:val="right"/>
+            </w:pPr>
+            <w:r>
+              <w:rPr>
+                <w:rFonts w:ascii="Times New Roman" w:cs="David" w:eastAsia="David" w:hAnsi="Times New Roman"/>
+                <w:b w:val="false"/>
+                <w:bCs w:val="false"/>
+                <w:sz w:val="18"/>
+                <w:szCs w:val="18"/>
+                <w:rtl/>
+              </w:rPr>
+              <w:t xml:space="preserve">סלפטי, י', זמיר, י', ושרף-בוסל, ד' (2019). למידה מבוססת תנועה. לקסי-קיי, 12, 19-21.</w:t>
+            </w:r>
+          </w:p>
+        </w:tc>
+        <w:tc>
+          <w:tcPr>
+            <w:tcW w:type="dxa" w:w="1700"/>
+          </w:tcPr>
+          <w:p>
+            <w:pPr>
+              <w:bidi/>
+              <w:spacing w:after="40" w:line="240"/>
+              <w:jc w:val="right"/>
+            </w:pPr>
+            <w:r>
+              <w:rPr>
+                <w:rFonts w:ascii="Times New Roman" w:cs="David" w:eastAsia="David" w:hAnsi="Times New Roman"/>
+                <w:b w:val="false"/>
+                <w:bCs w:val="false"/>
+                <w:sz w:val="18"/>
+                <w:szCs w:val="18"/>
+                <w:rtl/>
+              </w:rPr>
+              <w:t xml:space="preserve">סקירה קצרה בכתב עת של מכללת קיי</w:t>
+            </w:r>
+          </w:p>
+        </w:tc>
+        <w:tc>
+          <w:tcPr>
+            <w:tcW w:type="dxa" w:w="2300"/>
+          </w:tcPr>
+          <w:p>
+            <w:pPr>
+              <w:bidi/>
+              <w:spacing w:after="40" w:line="240"/>
+              <w:jc w:val="right"/>
+            </w:pPr>
+            <w:r>
+              <w:rPr>
+                <w:rFonts w:ascii="Times New Roman" w:cs="David" w:eastAsia="David" w:hAnsi="Times New Roman"/>
+                <w:b w:val="false"/>
+                <w:bCs w:val="false"/>
+                <w:sz w:val="18"/>
+                <w:szCs w:val="18"/>
+                <w:rtl/>
+              </w:rPr>
+              <w:t xml:space="preserve">חופשי (PDF שנשלח)</w:t>
+            </w:r>
+          </w:p>
+        </w:tc>
+        <w:tc>
+          <w:tcPr>
+            <w:tcW w:type="dxa" w:w="3300"/>
+          </w:tcPr>
+          <w:p>
+            <w:pPr>
+              <w:bidi/>
+              <w:spacing w:after="40" w:line="240"/>
+              <w:jc w:val="right"/>
+            </w:pPr>
+            <w:r>
+              <w:rPr>
+                <w:rFonts w:ascii="Times New Roman" w:cs="David" w:eastAsia="David" w:hAnsi="Times New Roman"/>
+                <w:b w:val="false"/>
+                <w:bCs w:val="false"/>
+                <w:sz w:val="18"/>
+                <w:szCs w:val="18"/>
+                <w:rtl/>
+              </w:rPr>
+              <w:t xml:space="preserve">פעילות גופנית קשורה לתפקוד קוגניטיבי ולהישגים; המלצה לשלב תנועה בלמידה בחינוך המיוחד.</w:t>
+            </w:r>
+          </w:p>
+        </w:tc>
+        <w:tc>
+          <w:tcPr>
+            <w:tcW w:type="dxa" w:w="1500"/>
+          </w:tcPr>
+          <w:p>
+            <w:pPr>
+              <w:bidi/>
+              <w:spacing w:after="40" w:line="240"/>
+              <w:jc w:val="right"/>
+            </w:pPr>
+            <w:r>
+              <w:rPr>
+                <w:rFonts w:ascii="Times New Roman" w:cs="David" w:eastAsia="David" w:hAnsi="Times New Roman"/>
+                <w:b w:val="false"/>
+                <w:bCs w:val="false"/>
+                <w:sz w:val="18"/>
+                <w:szCs w:val="18"/>
+                <w:rtl/>
+              </w:rPr>
+              <w:t xml:space="preserve">1.4</w:t>
+            </w:r>
+          </w:p>
+        </w:tc>
+        <w:tc>
+          <w:tcPr>
+            <w:tcW w:type="dxa" w:w="1200"/>
+          </w:tcPr>
+          <w:p>
+            <w:pPr>
+              <w:bidi/>
+              <w:spacing w:after="40" w:line="240"/>
+              <w:jc w:val="right"/>
+            </w:pPr>
+            <w:r>
+              <w:rPr>
+                <w:rFonts w:ascii="Times New Roman" w:cs="David" w:eastAsia="David" w:hAnsi="Times New Roman"/>
+                <w:b w:val="false"/>
+                <w:bCs w:val="false"/>
+                <w:sz w:val="18"/>
+                <w:szCs w:val="18"/>
+                <w:rtl/>
+              </w:rPr>
+              <w:t xml:space="preserve">לוודא שהמאמר המלא הוא 3 עמודים בלבד</w:t>
             </w:r>
           </w:p>
         </w:tc>

</xml_diff>